<commit_message>
docs: completar el libro con los cuadernos 7 y 8
</commit_message>
<xml_diff>
--- a/Resumen_Cuadernos_Ciencia_de_Datos.docx
+++ b/Resumen_Cuadernos_Ciencia_de_Datos.docx
@@ -8,14 +8,7 @@
         <w:jc w:val="center"/>
       </w:pPr>
       <w:r>
-        <w:rPr>
-          <w:b/>
-          <w:bCs/>
-          <w:color w:val="1F4E79"/>
-          <w:sz w:val="48"/>
-          <w:szCs w:val="48"/>
-        </w:rPr>
-        <w:t xml:space="preserve">Resumen de los Cuadernos Numerados</w:t>
+        <w:t>Apuntes de Ciencia de Datos</w:t>
       </w:r>
     </w:p>
     <w:p>
@@ -37,13 +30,7 @@
         <w:jc w:val="center"/>
       </w:pPr>
       <w:r>
-        <w:rPr>
-          <w:i/>
-          <w:iCs/>
-          <w:sz w:val="24"/>
-          <w:szCs w:val="24"/>
-        </w:rPr>
-        <w:t xml:space="preserve">Guía de estudio para el parcial teórico</w:t>
+        <w:t>Libro de estudio para el parcial teórico</w:t>
       </w:r>
     </w:p>
     <w:p>
@@ -51,12 +38,7 @@
         <w:jc w:val="center"/>
       </w:pPr>
       <w:r>
-        <w:rPr>
-          <w:color w:val="595959"/>
-          <w:sz w:val="20"/>
-          <w:szCs w:val="20"/>
-        </w:rPr>
-        <w:t xml:space="preserve">Fuente: repositorio AndiLinUnab/ciencia-de-datos-apuntes</w:t>
+        <w:t>Base del curso: https://github.com/adiacla/Apuntes-Ciencia-de-Datos | Material complementario: https://github.com/AndiLinUnab/ciencia-de-datos-apuntes</w:t>
       </w:r>
     </w:p>
     <w:p>
@@ -64,12 +46,7 @@
         <w:jc w:val="center"/>
       </w:pPr>
       <w:r>
-        <w:rPr>
-          <w:color w:val="595959"/>
-          <w:sz w:val="20"/>
-          <w:szCs w:val="20"/>
-        </w:rPr>
-        <w:t xml:space="preserve">Cuadernos del prof. Alfredo Díaz — UNAB 2026</w:t>
+        <w:t>Guía explicativa basada en los cuadernos del curso. Los cuadernos 6, 7 y 8 se completaron con los archivos compartidos en clase.</w:t>
       </w:r>
     </w:p>
     <w:p>
@@ -23138,6 +23115,275 @@
       </w:r>
       <w:r>
         <w:t xml:space="preserve"> durante el entrenamiento. Por eso este cuaderno es la base para el procesamiento de imágenes con Deep Learning.</w:t>
+      </w:r>
+    </w:p>
+    <w:p>
+      <w:pPr>
+        <w:pStyle w:val="Heading1"/>
+      </w:pPr>
+      <w:r>
+        <w:t>Cuaderno 7. Redes neuronales convolucionales</w:t>
+      </w:r>
+    </w:p>
+    <w:p>
+      <w:r>
+        <w:t>Este cuaderno construye una CNN para clasificar imágenes de CIFAR-10. La idea esencial es que una red convolucional aprovecha la estructura espacial de una imagen: los píxeles vecinos forman bordes, texturas y partes de objetos. En lugar de tratar cada píxel como una entrada aislada, la CNN busca patrones locales y los combina a través de varias capas.</w:t>
+      </w:r>
+    </w:p>
+    <w:p>
+      <w:pPr>
+        <w:pStyle w:val="Heading2"/>
+      </w:pPr>
+      <w:r>
+        <w:t>7.1 CIFAR-10 e imágenes como tensores</w:t>
+      </w:r>
+    </w:p>
+    <w:p>
+      <w:r>
+        <w:t>CIFAR-10 contiene 50.000 imágenes de entrenamiento y 10.000 de prueba. Cada imagen tiene 32×32 píxeles, tres canales de color y una etiqueta de una entre diez clases: avión, automóvil, pájaro, gato, ciervo, perro, rana, caballo, barco o camión. La forma (32, 32, 3) representa alto, ancho y canales. Un lote añade otra dimensión al inicio para indicar cuántas imágenes se procesan juntas.</w:t>
+      </w:r>
+    </w:p>
+    <w:p>
+      <w:r>
+        <w:t>Los píxeles originalmente están entre 0 y 255. Dividirlos por 255 los lleva a [0, 1]. Esta normalización conserva el contenido de la imagen, pero hace más manejable la escala de los datos durante el entrenamiento.</w:t>
+      </w:r>
+    </w:p>
+    <w:p>
+      <w:pPr>
+        <w:pStyle w:val="Heading2"/>
+      </w:pPr>
+      <w:r>
+        <w:t>7.2 Convolución y filtros aprendidos</w:t>
+      </w:r>
+    </w:p>
+    <w:p>
+      <w:r>
+        <w:t>La convolución desliza una matriz pequeña llamada filtro o kernel sobre la imagen. En cada posición multiplica sus valores por los píxeles vecinos y suma los productos. El resultado indica cuánto coincide esa región con el patrón del filtro. Cada filtro produce un mapa de características; una capa con 32 filtros entrega 32 mapas o canales.</w:t>
+      </w:r>
+    </w:p>
+    <w:p>
+      <w:r>
+        <w:t>En procesamiento de imágenes clásico, una persona elige el kernel, por ejemplo Sobel para bordes. En una CNN entrenable, los valores de los filtros se aprenden con los datos mediante retropropagación y descenso del gradiente. La misma matriz se reutiliza en distintas posiciones: esta compartición de pesos reduce parámetros y permite detectar un patrón aunque cambie de lugar. Las primeras capas suelen aprender bordes y texturas; las posteriores combinan esos patrones en representaciones más complejas.</w:t>
+      </w:r>
+    </w:p>
+    <w:p>
+      <w:r>
+        <w:t>El tamaño espacial de la salida depende también del stride (cuánto avanza el filtro) y el padding (si se agregan píxeles alrededor). Con filtro 3×3, stride 1 y sin padding, la dimensión 32×32 pasa a 30×30. Padding same puede conservar ancho y alto; un stride mayor los reduce más rápidamente.</w:t>
+      </w:r>
+    </w:p>
+    <w:p>
+      <w:pPr>
+        <w:pStyle w:val="Heading2"/>
+      </w:pPr>
+      <w:r>
+        <w:t>7.3 ReLU y MaxPooling</w:t>
+      </w:r>
+    </w:p>
+    <w:p>
+      <w:r>
+        <w:t>ReLU conserva los valores positivos y transforma los negativos en cero. Su papel teórico es aportar no linealidad, necesaria para que una red profunda represente relaciones que no sean solo transformaciones lineales.</w:t>
+      </w:r>
+    </w:p>
+    <w:p>
+      <w:r>
+        <w:t>MaxPooling 2×2 divide el mapa en regiones y conserva el máximo de cada región. Reduce aproximadamente a la mitad el ancho y el alto, baja el costo de las capas posteriores y conserva respuestas fuertes. No aprende filtros: aplica una regla fija de reducción. En la arquitectura del cuaderno, las dimensiones espaciales bajan aproximadamente 32→30→15→13→6→4 mientras los canales pasan de 32 a 64.</w:t>
+      </w:r>
+    </w:p>
+    <w:p>
+      <w:pPr>
+        <w:pStyle w:val="Heading2"/>
+      </w:pPr>
+      <w:r>
+        <w:t>7.4 De los mapas a las clases</w:t>
+      </w:r>
+    </w:p>
+    <w:p>
+      <w:r>
+        <w:t>La salida convolucional final tiene forma 4×4×64. Flatten reorganiza esos 1.024 valores como un vector para entregarlo a capas densas. Luego una capa densa combina las características y la capa final entrega diez puntuaciones, una por clase.</w:t>
+      </w:r>
+    </w:p>
+    <w:p>
+      <w:r>
+        <w:t>Las puntuaciones finales son logits, no probabilidades. SparseCategoricalCrossentropy con from_logits=True recibe los logits y etiquetas enteras, y calcula una pérdida que guía la actualización de los pesos. Softmax puede convertir logits en probabilidades que suman uno; la clase elegida corresponde a la puntuación mayor. Sparse se refiere a etiquetas representadas como enteros, en vez de vectores one-hot.</w:t>
+      </w:r>
+    </w:p>
+    <w:p>
+      <w:pPr>
+        <w:pStyle w:val="Heading2"/>
+      </w:pPr>
+      <w:r>
+        <w:t>7.5 Entrenamiento, evaluación y generalización</w:t>
+      </w:r>
+    </w:p>
+    <w:p>
+      <w:r>
+        <w:t>El cuaderno usa Adam y entrena durante 30 épocas. Una época es una pasada completa por los datos de entrenamiento. Al final, la precisión de entrenamiento es cercana a 91 %, mientras que la precisión del conjunto presentado como validación queda cerca de 70 % y su pérdida aumenta en las últimas épocas. La diferencia sugiere sobreajuste: el modelo sigue mejorando sobre entrenamiento, pero no mejora igual en datos no vistos.</w:t>
+      </w:r>
+    </w:p>
+    <w:p>
+      <w:r>
+        <w:t>Advertencia del código: el conjunto de prueba se pasa como validation_data durante fit y luego se vuelve a evaluar como prueba. Así se consulta el rendimiento de prueba mientras avanza el entrenamiento, por lo que deja de ser una evaluación final plenamente independiente. Lo correcto es reservar train para aprender pesos, validation para decisiones de desarrollo y test para la medición final.</w:t>
+      </w:r>
+    </w:p>
+    <w:p>
+      <w:r>
+        <w:t>El modelo etiqueta como avión una foto de un bus redimensionada a 32×32. Al reducirla se pierde detalle y la fotografía tiene un dominio diferente al de CIFAR-10. El ejemplo recuerda que la predicción depende de los datos de entrenamiento, la resolución y la semejanza entre las imágenes nuevas y las conocidas.</w:t>
+      </w:r>
+    </w:p>
+    <w:p>
+      <w:pPr>
+        <w:pStyle w:val="Heading2"/>
+      </w:pPr>
+      <w:r>
+        <w:t>7.6 Tareas de visión por computadora</w:t>
+      </w:r>
+    </w:p>
+    <w:p>
+      <w:pPr>
+        <w:pStyle w:val="ListParagraph"/>
+      </w:pPr>
+      <w:r>
+        <w:t>Clasificación: asigna una categoría a una imagen completa.</w:t>
+      </w:r>
+    </w:p>
+    <w:p>
+      <w:pPr>
+        <w:pStyle w:val="ListParagraph"/>
+      </w:pPr>
+      <w:r>
+        <w:t>Detección: localiza y clasifica varios objetos, a menudo con recuadros.</w:t>
+      </w:r>
+    </w:p>
+    <w:p>
+      <w:pPr>
+        <w:pStyle w:val="ListParagraph"/>
+      </w:pPr>
+      <w:r>
+        <w:t>Segmentación: asigna una categoría a cada píxel.</w:t>
+      </w:r>
+    </w:p>
+    <w:p>
+      <w:pPr>
+        <w:pStyle w:val="ListParagraph"/>
+      </w:pPr>
+      <w:r>
+        <w:t>Aumento de datos: crea variaciones realistas para aportar diversidad al entrenamiento y reducir la memorización.</w:t>
+      </w:r>
+    </w:p>
+    <w:p>
+      <w:r>
+        <w:t>Este cuaderno conecta el procesamiento clásico del Cuaderno 6 con las CNN: Sobel o blur usan kernels definidos a mano; las CNN aprenden los valores de sus filtros a partir de ejemplos.</w:t>
+      </w:r>
+    </w:p>
+    <w:p>
+      <w:pPr>
+        <w:pStyle w:val="Heading1"/>
+      </w:pPr>
+      <w:r>
+        <w:t>Cuaderno 8. Aprendizaje por transferencia</w:t>
+      </w:r>
+    </w:p>
+    <w:p>
+      <w:r>
+        <w:t>El aprendizaje por transferencia reutiliza una red que ya aprendió con un conjunto de datos grande para resolver otra tarea relacionada. El taller adapta VGG16, preentrenada con ImageNet, a la clasificación binaria de gatos y perros. Así se aprovechan patrones visuales ya aprendidos en vez de ajustar toda una CNN desde cero con pocos ejemplos.</w:t>
+      </w:r>
+    </w:p>
+    <w:p>
+      <w:pPr>
+        <w:pStyle w:val="Heading2"/>
+      </w:pPr>
+      <w:r>
+        <w:t>8.1 Base preentrenada y clasificador nuevo</w:t>
+      </w:r>
+    </w:p>
+    <w:p>
+      <w:r>
+        <w:t>El modelo base extrae características visuales como bordes, texturas y formas. Sobre su salida se agrega un clasificador para las categorías nuevas. Al cargar VGG16 con include_top=False, se excluye la capa clasificadora original de ImageNet y se conserva la base convolucional.</w:t>
+      </w:r>
+    </w:p>
+    <w:p>
+      <w:pPr>
+        <w:pStyle w:val="Heading2"/>
+      </w:pPr>
+      <w:r>
+        <w:t>8.2 Extracción de características</w:t>
+      </w:r>
+    </w:p>
+    <w:p>
+      <w:r>
+        <w:t>En el aprendizaje por transferencia básico se congela la base: sus pesos no se actualizan, aunque la red sigue procesando imágenes. Solo se entrena el clasificador añadido. Esta opción reduce cómputo y suele ser conveniente cuando hay pocos datos etiquetados o cuando el dominio nuevo se parece al original.</w:t>
+      </w:r>
+    </w:p>
+    <w:p>
+      <w:pPr>
+        <w:pStyle w:val="Heading2"/>
+      </w:pPr>
+      <w:r>
+        <w:t>8.3 Ajuste fino o fine-tuning</w:t>
+      </w:r>
+    </w:p>
+    <w:p>
+      <w:r>
+        <w:t>Después de entrenar el clasificador nuevo, se pueden descongelar algunas capas superiores de la base y entrenarlas también. Las primeras capas suelen aprender rasgos generales; las últimas, representaciones más especializadas. Por eso se suelen conservar las primeras y ajustar solo algunas finales. El ajuste fino debe usar una tasa de aprendizaje baja para no destruir con cambios bruscos los pesos útiles. Transfer learning es la estrategia general; fine-tuning es una modalidad que actualiza parte del modelo preentrenado.</w:t>
+      </w:r>
+    </w:p>
+    <w:p>
+      <w:r>
+        <w:t>No conviene empezar entrenando conjuntamente una cabeza aleatoria y toda la base: las actualizaciones grandes del clasificador nuevo pueden deteriorar lo aprendido. Primero se entrena la cabeza con la base congelada; después, si hay datos suficientes, se afina una parte de la base y se vuelve a compilar el modelo.</w:t>
+      </w:r>
+    </w:p>
+    <w:p>
+      <w:pPr>
+        <w:pStyle w:val="Heading2"/>
+      </w:pPr>
+      <w:r>
+        <w:t>8.4 Entrada y preprocesamiento</w:t>
+      </w:r>
+    </w:p>
+    <w:p>
+      <w:r>
+        <w:t>Las imágenes se redimensionan al tamaño que espera el modelo. El código usa 224×224×3 para VGG16. También se aplica el preprocesamiento específico de VGG16 antes de enviar los píxeles a la red. Cada arquitectura puede esperar una escala distinta; no se debe asumir que normalizar siempre es simplemente dividir entre 255. Preprocesamiento de entrenamiento e inferencia debe coincidir.</w:t>
+      </w:r>
+    </w:p>
+    <w:p>
+      <w:r>
+        <w:t>El aumento de datos aplica volteos, rotaciones moderadas, zoom o cambios pequeños de contraste durante el entrenamiento. Busca que la red reconozca un objeto bajo variaciones razonables. Solo es útil si esas transformaciones no cambian la etiqueta correcta.</w:t>
+      </w:r>
+    </w:p>
+    <w:p>
+      <w:pPr>
+        <w:pStyle w:val="Heading2"/>
+      </w:pPr>
+      <w:r>
+        <w:t>8.5 GlobalAveragePooling y clasificación binaria</w:t>
+      </w:r>
+    </w:p>
+    <w:p>
+      <w:r>
+        <w:t>VGG16 produce mapas de características de forma 7×7×512 para esta entrada. GlobalAveragePooling2D promedia cada mapa espacialmente y deja 512 valores por imagen. Es una representación compacta; Flatten conservaría los 25.088 valores y exigiría muchos más parámetros en la capa densa siguiente.</w:t>
+      </w:r>
+    </w:p>
+    <w:p>
+      <w:r>
+        <w:t>El modelo agrega una capa densa intermedia, Dropout y una salida sigmoide. Sigmoid entrega un valor entre cero y uno para la clase binaria; con un umbral de 0,5 se toma una decisión entre las dos categorías. BinaryCrossentropy mide el error frente a la etiqueta binaria. Dropout desactiva aleatoriamente algunas activaciones durante entrenamiento para ayudar a reducir sobreajuste.</w:t>
+      </w:r>
+    </w:p>
+    <w:p>
+      <w:pPr>
+        <w:pStyle w:val="Heading2"/>
+      </w:pPr>
+      <w:r>
+        <w:t>8.6 Evaluación y límites</w:t>
+      </w:r>
+    </w:p>
+    <w:p>
+      <w:r>
+        <w:t>Train ajusta parámetros, validation orienta las decisiones del desarrollo y test se reserva para la evaluación final. El cuaderno reporta precisión de validación cercana al 98 % en el ajuste fino. No garantiza ese rendimiento en cualquier colección de fotos: importan el tamaño y la representatividad del conjunto, su separación y el parecido con los datos usados para preentrenar.</w:t>
+      </w:r>
+    </w:p>
+    <w:p>
+      <w:r>
+        <w:t>Hay comentarios que alternan los nombres MobileNetV2 y VGG16. En el taller de gatos y perros, la arquitectura que realmente se construye es VGG16 y su salida observada es 7×7×512. MobileNetV2 aparece en recomendaciones y explicaciones generales. BERT también se menciona como modelo preentrenado, pero es un modelo de lenguaje, no una CNN para imágenes.</w:t>
       </w:r>
     </w:p>
     <w:p>

</xml_diff>